<commit_message>
feat: update template_surat_keterangan_penyerahan_skripsi to change 'Email' to 'Google Form'
</commit_message>
<xml_diff>
--- a/src/templates/template_SK_skripsi.docx
+++ b/src/templates/template_SK_skripsi.docx
@@ -5,6 +5,7 @@
     <w:p>
       <w:pPr>
         <w:pStyle w:val="Title"/>
+        <w:jc w:val="left"/>
         <w:rPr>
           <w:b w:val="0"/>
           <w:sz w:val="6"/>
@@ -3076,13 +3077,497 @@
     </w:p>
     <w:p/>
     <w:sectPr>
+      <w:headerReference w:type="default" r:id="rId8"/>
       <w:pgSz w:w="12240" w:h="20160" w:code="5"/>
-      <w:pgMar w:top="2835" w:right="1134" w:bottom="1440" w:left="1021" w:header="720" w:footer="720" w:gutter="0"/>
+      <w:pgMar w:top="2835" w:right="1134" w:bottom="1440" w:left="1021" w:header="505" w:footer="709" w:gutter="0"/>
       <w:cols w:space="720"/>
       <w:docGrid w:linePitch="360"/>
     </w:sectPr>
   </w:body>
 </w:document>
+</file>
+
+<file path=word/endnotes.xml><?xml version="1.0" encoding="utf-8"?>
+<w:endnotes xmlns:wpc="http://schemas.microsoft.com/office/word/2010/wordprocessingCanvas" xmlns:cx="http://schemas.microsoft.com/office/drawing/2014/chartex" xmlns:cx1="http://schemas.microsoft.com/office/drawing/2015/9/8/chartex" xmlns:cx2="http://schemas.microsoft.com/office/drawing/2015/10/21/chartex" xmlns:cx3="http://schemas.microsoft.com/office/drawing/2016/5/9/chartex" xmlns:cx4="http://schemas.microsoft.com/office/drawing/2016/5/10/chartex" xmlns:cx5="http://schemas.microsoft.com/office/drawing/2016/5/11/chartex" xmlns:cx6="http://schemas.microsoft.com/office/drawing/2016/5/12/chartex" xmlns:cx7="http://schemas.microsoft.com/office/drawing/2016/5/13/chartex" xmlns:cx8="http://schemas.microsoft.com/office/drawing/2016/5/14/chartex" xmlns:mc="http://schemas.openxmlformats.org/markup-compatibility/2006" xmlns:aink="http://schemas.microsoft.com/office/drawing/2016/ink" xmlns:am3d="http://schemas.microsoft.com/office/drawing/2017/model3d" xmlns:o="urn:schemas-microsoft-com:office:office" xmlns:oel="http://schemas.microsoft.com/office/2019/extlst" xmlns:r="http://schemas.openxmlformats.org/officeDocument/2006/relationships" xmlns:m="http://schemas.openxmlformats.org/officeDocument/2006/math" xmlns:v="urn:schemas-microsoft-com:vml" xmlns:wp14="http://schemas.microsoft.com/office/word/2010/wordprocessingDrawing" xmlns:wp="http://schemas.openxmlformats.org/drawingml/2006/wordprocessingDrawing" xmlns:w10="urn:schemas-microsoft-com:office:word" xmlns:w="http://schemas.openxmlformats.org/wordprocessingml/2006/main" xmlns:w14="http://schemas.microsoft.com/office/word/2010/wordml" xmlns:w15="http://schemas.microsoft.com/office/word/2012/wordml" xmlns:w16cex="http://schemas.microsoft.com/office/word/2018/wordml/cex" xmlns:w16cid="http://schemas.microsoft.com/office/word/2016/wordml/cid" xmlns:w16="http://schemas.microsoft.com/office/word/2018/wordml" xmlns:w16du="http://schemas.microsoft.com/office/word/2023/wordml/word16du" xmlns:w16sdtdh="http://schemas.microsoft.com/office/word/2020/wordml/sdtdatahash" xmlns:w16sdtfl="http://schemas.microsoft.com/office/word/2024/wordml/sdtformatlock" xmlns:w16se="http://schemas.microsoft.com/office/word/2015/wordml/symex" xmlns:wpg="http://schemas.microsoft.com/office/word/2010/wordprocessingGroup" xmlns:wpi="http://schemas.microsoft.com/office/word/2010/wordprocessingInk" xmlns:wne="http://schemas.microsoft.com/office/word/2006/wordml" xmlns:wps="http://schemas.microsoft.com/office/word/2010/wordprocessingShape" mc:Ignorable="w14 w15 w16se w16cid w16 w16cex w16sdtdh w16sdtfl w16du wp14">
+  <w:endnote w:type="separator" w:id="-1">
+    <w:p>
+      <w:pPr>
+        <w:spacing w:after="0" w:line="240" w:lineRule="auto"/>
+      </w:pPr>
+      <w:r>
+        <w:separator/>
+      </w:r>
+    </w:p>
+  </w:endnote>
+  <w:endnote w:type="continuationSeparator" w:id="0">
+    <w:p>
+      <w:pPr>
+        <w:spacing w:after="0" w:line="240" w:lineRule="auto"/>
+      </w:pPr>
+      <w:r>
+        <w:continuationSeparator/>
+      </w:r>
+    </w:p>
+  </w:endnote>
+</w:endnotes>
+</file>
+
+<file path=word/footnotes.xml><?xml version="1.0" encoding="utf-8"?>
+<w:footnotes xmlns:wpc="http://schemas.microsoft.com/office/word/2010/wordprocessingCanvas" xmlns:cx="http://schemas.microsoft.com/office/drawing/2014/chartex" xmlns:cx1="http://schemas.microsoft.com/office/drawing/2015/9/8/chartex" xmlns:cx2="http://schemas.microsoft.com/office/drawing/2015/10/21/chartex" xmlns:cx3="http://schemas.microsoft.com/office/drawing/2016/5/9/chartex" xmlns:cx4="http://schemas.microsoft.com/office/drawing/2016/5/10/chartex" xmlns:cx5="http://schemas.microsoft.com/office/drawing/2016/5/11/chartex" xmlns:cx6="http://schemas.microsoft.com/office/drawing/2016/5/12/chartex" xmlns:cx7="http://schemas.microsoft.com/office/drawing/2016/5/13/chartex" xmlns:cx8="http://schemas.microsoft.com/office/drawing/2016/5/14/chartex" xmlns:mc="http://schemas.openxmlformats.org/markup-compatibility/2006" xmlns:aink="http://schemas.microsoft.com/office/drawing/2016/ink" xmlns:am3d="http://schemas.microsoft.com/office/drawing/2017/model3d" xmlns:o="urn:schemas-microsoft-com:office:office" xmlns:oel="http://schemas.microsoft.com/office/2019/extlst" xmlns:r="http://schemas.openxmlformats.org/officeDocument/2006/relationships" xmlns:m="http://schemas.openxmlformats.org/officeDocument/2006/math" xmlns:v="urn:schemas-microsoft-com:vml" xmlns:wp14="http://schemas.microsoft.com/office/word/2010/wordprocessingDrawing" xmlns:wp="http://schemas.openxmlformats.org/drawingml/2006/wordprocessingDrawing" xmlns:w10="urn:schemas-microsoft-com:office:word" xmlns:w="http://schemas.openxmlformats.org/wordprocessingml/2006/main" xmlns:w14="http://schemas.microsoft.com/office/word/2010/wordml" xmlns:w15="http://schemas.microsoft.com/office/word/2012/wordml" xmlns:w16cex="http://schemas.microsoft.com/office/word/2018/wordml/cex" xmlns:w16cid="http://schemas.microsoft.com/office/word/2016/wordml/cid" xmlns:w16="http://schemas.microsoft.com/office/word/2018/wordml" xmlns:w16du="http://schemas.microsoft.com/office/word/2023/wordml/word16du" xmlns:w16sdtdh="http://schemas.microsoft.com/office/word/2020/wordml/sdtdatahash" xmlns:w16sdtfl="http://schemas.microsoft.com/office/word/2024/wordml/sdtformatlock" xmlns:w16se="http://schemas.microsoft.com/office/word/2015/wordml/symex" xmlns:wpg="http://schemas.microsoft.com/office/word/2010/wordprocessingGroup" xmlns:wpi="http://schemas.microsoft.com/office/word/2010/wordprocessingInk" xmlns:wne="http://schemas.microsoft.com/office/word/2006/wordml" xmlns:wps="http://schemas.microsoft.com/office/word/2010/wordprocessingShape" mc:Ignorable="w14 w15 w16se w16cid w16 w16cex w16sdtdh w16sdtfl w16du wp14">
+  <w:footnote w:type="separator" w:id="-1">
+    <w:p>
+      <w:pPr>
+        <w:spacing w:after="0" w:line="240" w:lineRule="auto"/>
+      </w:pPr>
+      <w:r>
+        <w:separator/>
+      </w:r>
+    </w:p>
+  </w:footnote>
+  <w:footnote w:type="continuationSeparator" w:id="0">
+    <w:p>
+      <w:pPr>
+        <w:spacing w:after="0" w:line="240" w:lineRule="auto"/>
+      </w:pPr>
+      <w:r>
+        <w:continuationSeparator/>
+      </w:r>
+    </w:p>
+  </w:footnote>
+</w:footnotes>
+</file>
+
+<file path=word/header1.xml><?xml version="1.0" encoding="utf-8"?>
+<w:hdr xmlns:wpc="http://schemas.microsoft.com/office/word/2010/wordprocessingCanvas" xmlns:cx="http://schemas.microsoft.com/office/drawing/2014/chartex" xmlns:cx1="http://schemas.microsoft.com/office/drawing/2015/9/8/chartex" xmlns:cx2="http://schemas.microsoft.com/office/drawing/2015/10/21/chartex" xmlns:cx3="http://schemas.microsoft.com/office/drawing/2016/5/9/chartex" xmlns:cx4="http://schemas.microsoft.com/office/drawing/2016/5/10/chartex" xmlns:cx5="http://schemas.microsoft.com/office/drawing/2016/5/11/chartex" xmlns:cx6="http://schemas.microsoft.com/office/drawing/2016/5/12/chartex" xmlns:cx7="http://schemas.microsoft.com/office/drawing/2016/5/13/chartex" xmlns:cx8="http://schemas.microsoft.com/office/drawing/2016/5/14/chartex" xmlns:mc="http://schemas.openxmlformats.org/markup-compatibility/2006" xmlns:aink="http://schemas.microsoft.com/office/drawing/2016/ink" xmlns:am3d="http://schemas.microsoft.com/office/drawing/2017/model3d" xmlns:o="urn:schemas-microsoft-com:office:office" xmlns:oel="http://schemas.microsoft.com/office/2019/extlst" xmlns:r="http://schemas.openxmlformats.org/officeDocument/2006/relationships" xmlns:m="http://schemas.openxmlformats.org/officeDocument/2006/math" xmlns:v="urn:schemas-microsoft-com:vml" xmlns:wp14="http://schemas.microsoft.com/office/word/2010/wordprocessingDrawing" xmlns:wp="http://schemas.openxmlformats.org/drawingml/2006/wordprocessingDrawing" xmlns:w10="urn:schemas-microsoft-com:office:word" xmlns:w="http://schemas.openxmlformats.org/wordprocessingml/2006/main" xmlns:w14="http://schemas.microsoft.com/office/word/2010/wordml" xmlns:w15="http://schemas.microsoft.com/office/word/2012/wordml" xmlns:w16cex="http://schemas.microsoft.com/office/word/2018/wordml/cex" xmlns:w16cid="http://schemas.microsoft.com/office/word/2016/wordml/cid" xmlns:w16="http://schemas.microsoft.com/office/word/2018/wordml" xmlns:w16du="http://schemas.microsoft.com/office/word/2023/wordml/word16du" xmlns:w16sdtdh="http://schemas.microsoft.com/office/word/2020/wordml/sdtdatahash" xmlns:w16sdtfl="http://schemas.microsoft.com/office/word/2024/wordml/sdtformatlock" xmlns:w16se="http://schemas.microsoft.com/office/word/2015/wordml/symex" xmlns:wpg="http://schemas.microsoft.com/office/word/2010/wordprocessingGroup" xmlns:wpi="http://schemas.microsoft.com/office/word/2010/wordprocessingInk" xmlns:wne="http://schemas.microsoft.com/office/word/2006/wordml" xmlns:wps="http://schemas.microsoft.com/office/word/2010/wordprocessingShape" mc:Ignorable="w14 w15 w16se w16cid w16 w16cex w16sdtdh w16sdtfl w16du wp14">
+  <w:p>
+    <w:pPr>
+      <w:pStyle w:val="Header"/>
+      <w:ind w:left="2070"/>
+      <w:jc w:val="center"/>
+      <w:rPr>
+        <w:rFonts w:ascii="Times New Roman" w:hAnsi="Times New Roman" w:cs="Times New Roman"/>
+        <w:b/>
+        <w:bCs/>
+        <w:color w:val="800080"/>
+        <w:spacing w:val="16"/>
+        <w:sz w:val="40"/>
+        <w:szCs w:val="40"/>
+      </w:rPr>
+    </w:pPr>
+    <w:r>
+      <w:rPr>
+        <w:rFonts w:ascii="Times New Roman" w:hAnsi="Times New Roman" w:cs="Times New Roman"/>
+        <w:b/>
+        <w:bCs/>
+        <w:noProof/>
+        <w:color w:val="800080"/>
+        <w:spacing w:val="16"/>
+        <w:sz w:val="40"/>
+        <w:szCs w:val="40"/>
+      </w:rPr>
+      <w:drawing>
+        <wp:anchor distT="0" distB="0" distL="114300" distR="114300" simplePos="0" relativeHeight="251661312" behindDoc="0" locked="0" layoutInCell="1" allowOverlap="1" wp14:anchorId="0331C6F3" wp14:editId="27AA0AB5">
+          <wp:simplePos x="0" y="0"/>
+          <wp:positionH relativeFrom="column">
+            <wp:posOffset>109073</wp:posOffset>
+          </wp:positionH>
+          <wp:positionV relativeFrom="paragraph">
+            <wp:posOffset>42545</wp:posOffset>
+          </wp:positionV>
+          <wp:extent cx="1118235" cy="1120140"/>
+          <wp:effectExtent l="0" t="0" r="5715" b="3810"/>
+          <wp:wrapSquare wrapText="bothSides"/>
+          <wp:docPr id="128038944" name="Picture 128038944"/>
+          <wp:cNvGraphicFramePr>
+            <a:graphicFrameLocks xmlns:a="http://schemas.openxmlformats.org/drawingml/2006/main" noChangeAspect="1"/>
+          </wp:cNvGraphicFramePr>
+          <a:graphic xmlns:a="http://schemas.openxmlformats.org/drawingml/2006/main">
+            <a:graphicData uri="http://schemas.openxmlformats.org/drawingml/2006/picture">
+              <pic:pic xmlns:pic="http://schemas.openxmlformats.org/drawingml/2006/picture">
+                <pic:nvPicPr>
+                  <pic:cNvPr id="0" name="Picture 3"/>
+                  <pic:cNvPicPr>
+                    <a:picLocks noChangeAspect="1" noChangeArrowheads="1"/>
+                  </pic:cNvPicPr>
+                </pic:nvPicPr>
+                <pic:blipFill>
+                  <a:blip r:embed="rId1">
+                    <a:extLst>
+                      <a:ext uri="{28A0092B-C50C-407E-A947-70E740481C1C}">
+                        <a14:useLocalDpi xmlns:a14="http://schemas.microsoft.com/office/drawing/2010/main" val="0"/>
+                      </a:ext>
+                    </a:extLst>
+                  </a:blip>
+                  <a:srcRect/>
+                  <a:stretch>
+                    <a:fillRect/>
+                  </a:stretch>
+                </pic:blipFill>
+                <pic:spPr bwMode="auto">
+                  <a:xfrm>
+                    <a:off x="0" y="0"/>
+                    <a:ext cx="1118235" cy="1120140"/>
+                  </a:xfrm>
+                  <a:prstGeom prst="rect">
+                    <a:avLst/>
+                  </a:prstGeom>
+                  <a:noFill/>
+                  <a:ln>
+                    <a:noFill/>
+                  </a:ln>
+                </pic:spPr>
+              </pic:pic>
+            </a:graphicData>
+          </a:graphic>
+          <wp14:sizeRelH relativeFrom="page">
+            <wp14:pctWidth>0</wp14:pctWidth>
+          </wp14:sizeRelH>
+          <wp14:sizeRelV relativeFrom="page">
+            <wp14:pctHeight>0</wp14:pctHeight>
+          </wp14:sizeRelV>
+        </wp:anchor>
+      </w:drawing>
+    </w:r>
+    <w:r>
+      <w:rPr>
+        <w:rFonts w:ascii="Times New Roman" w:hAnsi="Times New Roman" w:cs="Times New Roman"/>
+        <w:b/>
+        <w:bCs/>
+        <w:color w:val="800080"/>
+        <w:spacing w:val="16"/>
+        <w:sz w:val="40"/>
+        <w:szCs w:val="40"/>
+      </w:rPr>
+      <w:t>UNIVERSITAS</w:t>
+    </w:r>
+  </w:p>
+  <w:p>
+    <w:pPr>
+      <w:pStyle w:val="Header"/>
+      <w:ind w:left="2070"/>
+      <w:jc w:val="center"/>
+      <w:rPr>
+        <w:rFonts w:ascii="Times New Roman" w:hAnsi="Times New Roman" w:cs="Times New Roman"/>
+        <w:b/>
+        <w:bCs/>
+        <w:color w:val="800080"/>
+        <w:spacing w:val="16"/>
+        <w:sz w:val="40"/>
+        <w:szCs w:val="40"/>
+      </w:rPr>
+    </w:pPr>
+    <w:r>
+      <w:rPr>
+        <w:rFonts w:ascii="Times New Roman" w:hAnsi="Times New Roman" w:cs="Times New Roman"/>
+        <w:b/>
+        <w:bCs/>
+        <w:color w:val="800080"/>
+        <w:spacing w:val="16"/>
+        <w:sz w:val="40"/>
+        <w:szCs w:val="40"/>
+      </w:rPr>
+      <w:t>WIDYA DHARMA PONTIANAK</w:t>
+    </w:r>
+  </w:p>
+  <w:p>
+    <w:pPr>
+      <w:pStyle w:val="Header"/>
+      <w:ind w:left="2070"/>
+      <w:jc w:val="center"/>
+      <w:rPr>
+        <w:rFonts w:ascii="Times New Roman" w:hAnsi="Times New Roman" w:cs="Times New Roman"/>
+        <w:b/>
+        <w:bCs/>
+        <w:color w:val="800080"/>
+        <w:spacing w:val="16"/>
+        <w:sz w:val="32"/>
+        <w:szCs w:val="32"/>
+      </w:rPr>
+    </w:pPr>
+    <w:r>
+      <w:rPr>
+        <w:rFonts w:ascii="Times New Roman" w:hAnsi="Times New Roman" w:cs="Times New Roman"/>
+        <w:b/>
+        <w:bCs/>
+        <w:color w:val="800080"/>
+        <w:spacing w:val="16"/>
+        <w:sz w:val="32"/>
+        <w:szCs w:val="32"/>
+      </w:rPr>
+      <w:t>FAKULTAS TEKNOLOGI INFORMASI</w:t>
+    </w:r>
+  </w:p>
+  <w:p>
+    <w:pPr>
+      <w:pStyle w:val="Header"/>
+      <w:ind w:left="2070"/>
+      <w:jc w:val="center"/>
+      <w:rPr>
+        <w:rFonts w:ascii="Times New Roman" w:hAnsi="Times New Roman" w:cs="Times New Roman"/>
+        <w:b/>
+        <w:bCs/>
+        <w:color w:val="800080"/>
+        <w:spacing w:val="16"/>
+        <w:sz w:val="20"/>
+      </w:rPr>
+    </w:pPr>
+    <w:r>
+      <w:rPr>
+        <w:rFonts w:ascii="Times New Roman" w:hAnsi="Times New Roman" w:cs="Times New Roman"/>
+        <w:b/>
+        <w:bCs/>
+        <w:color w:val="800080"/>
+        <w:spacing w:val="16"/>
+        <w:sz w:val="20"/>
+      </w:rPr>
+      <w:t>SK MENRISTEKDIKTI NO. 784/KPT/I/2019</w:t>
+    </w:r>
+  </w:p>
+  <w:p>
+    <w:pPr>
+      <w:pStyle w:val="Header"/>
+      <w:ind w:left="2070"/>
+      <w:jc w:val="center"/>
+      <w:rPr>
+        <w:rFonts w:ascii="Times New Roman" w:hAnsi="Times New Roman" w:cs="Times New Roman"/>
+        <w:b/>
+        <w:bCs/>
+        <w:color w:val="800080"/>
+        <w:spacing w:val="16"/>
+        <w:sz w:val="18"/>
+        <w:szCs w:val="18"/>
+      </w:rPr>
+    </w:pPr>
+    <w:r>
+      <w:rPr>
+        <w:rFonts w:ascii="Times New Roman" w:hAnsi="Times New Roman" w:cs="Times New Roman"/>
+        <w:b/>
+        <w:bCs/>
+        <w:color w:val="800080"/>
+        <w:spacing w:val="16"/>
+        <w:sz w:val="18"/>
+        <w:szCs w:val="18"/>
+      </w:rPr>
+      <w:t xml:space="preserve">Jalan H.O.S. </w:t>
+    </w:r>
+    <w:proofErr w:type="spellStart"/>
+    <w:r>
+      <w:rPr>
+        <w:rFonts w:ascii="Times New Roman" w:hAnsi="Times New Roman" w:cs="Times New Roman"/>
+        <w:b/>
+        <w:bCs/>
+        <w:color w:val="800080"/>
+        <w:spacing w:val="16"/>
+        <w:sz w:val="18"/>
+        <w:szCs w:val="18"/>
+      </w:rPr>
+      <w:t>Cokroaminoto</w:t>
+    </w:r>
+    <w:proofErr w:type="spellEnd"/>
+    <w:r>
+      <w:rPr>
+        <w:rFonts w:ascii="Times New Roman" w:hAnsi="Times New Roman" w:cs="Times New Roman"/>
+        <w:b/>
+        <w:bCs/>
+        <w:color w:val="800080"/>
+        <w:spacing w:val="16"/>
+        <w:sz w:val="18"/>
+        <w:szCs w:val="18"/>
+      </w:rPr>
+      <w:t xml:space="preserve"> No. 445 Telp. 731966 – 742063. Fax. 739191</w:t>
+    </w:r>
+  </w:p>
+  <w:p>
+    <w:pPr>
+      <w:pStyle w:val="Header"/>
+      <w:ind w:left="2070"/>
+      <w:jc w:val="center"/>
+      <w:rPr>
+        <w:rFonts w:ascii="Times New Roman" w:hAnsi="Times New Roman" w:cs="Times New Roman"/>
+        <w:b/>
+        <w:bCs/>
+        <w:color w:val="800080"/>
+        <w:spacing w:val="16"/>
+        <w:sz w:val="20"/>
+      </w:rPr>
+    </w:pPr>
+    <w:r>
+      <w:rPr>
+        <w:rFonts w:ascii="Times New Roman" w:hAnsi="Times New Roman" w:cs="Times New Roman"/>
+        <w:b/>
+        <w:bCs/>
+        <w:color w:val="800080"/>
+        <w:spacing w:val="16"/>
+        <w:sz w:val="20"/>
+      </w:rPr>
+      <w:t>Pontianak, Kalbar</w:t>
+    </w:r>
+  </w:p>
+  <w:p>
+    <w:pPr>
+      <w:pStyle w:val="Header"/>
+      <w:jc w:val="center"/>
+      <w:rPr>
+        <w:rFonts w:ascii="Times New Roman" w:hAnsi="Times New Roman" w:cs="Times New Roman"/>
+        <w:b/>
+        <w:bCs/>
+      </w:rPr>
+    </w:pPr>
+    <w:r>
+      <w:rPr>
+        <w:rFonts w:ascii="Times New Roman" w:hAnsi="Times New Roman" w:cs="Times New Roman"/>
+        <w:b/>
+        <w:bCs/>
+        <w:noProof/>
+      </w:rPr>
+      <mc:AlternateContent>
+        <mc:Choice Requires="wps">
+          <w:drawing>
+            <wp:anchor distT="0" distB="0" distL="114300" distR="114300" simplePos="0" relativeHeight="251659264" behindDoc="0" locked="0" layoutInCell="1" allowOverlap="1" wp14:anchorId="41697E99" wp14:editId="072A90F2">
+              <wp:simplePos x="0" y="0"/>
+              <wp:positionH relativeFrom="margin">
+                <wp:posOffset>-1270</wp:posOffset>
+              </wp:positionH>
+              <wp:positionV relativeFrom="paragraph">
+                <wp:posOffset>41910</wp:posOffset>
+              </wp:positionV>
+              <wp:extent cx="6310630" cy="0"/>
+              <wp:effectExtent l="0" t="0" r="0" b="0"/>
+              <wp:wrapNone/>
+              <wp:docPr id="6" name="Straight Connector 6"/>
+              <wp:cNvGraphicFramePr/>
+              <a:graphic xmlns:a="http://schemas.openxmlformats.org/drawingml/2006/main">
+                <a:graphicData uri="http://schemas.microsoft.com/office/word/2010/wordprocessingShape">
+                  <wps:wsp>
+                    <wps:cNvCnPr/>
+                    <wps:spPr>
+                      <a:xfrm>
+                        <a:off x="0" y="0"/>
+                        <a:ext cx="6310630" cy="0"/>
+                      </a:xfrm>
+                      <a:prstGeom prst="line">
+                        <a:avLst/>
+                      </a:prstGeom>
+                      <a:ln w="19050">
+                        <a:solidFill>
+                          <a:schemeClr val="tx1"/>
+                        </a:solidFill>
+                      </a:ln>
+                    </wps:spPr>
+                    <wps:style>
+                      <a:lnRef idx="1">
+                        <a:schemeClr val="accent1"/>
+                      </a:lnRef>
+                      <a:fillRef idx="0">
+                        <a:schemeClr val="accent1"/>
+                      </a:fillRef>
+                      <a:effectRef idx="0">
+                        <a:schemeClr val="accent1"/>
+                      </a:effectRef>
+                      <a:fontRef idx="minor">
+                        <a:schemeClr val="tx1"/>
+                      </a:fontRef>
+                    </wps:style>
+                    <wps:bodyPr/>
+                  </wps:wsp>
+                </a:graphicData>
+              </a:graphic>
+              <wp14:sizeRelH relativeFrom="margin">
+                <wp14:pctWidth>0</wp14:pctWidth>
+              </wp14:sizeRelH>
+            </wp:anchor>
+          </w:drawing>
+        </mc:Choice>
+        <mc:Fallback>
+          <w:pict>
+            <v:line w14:anchorId="4ED1BEA8" id="Straight Connector 6" o:spid="_x0000_s1026" style="position:absolute;z-index:251659264;visibility:visible;mso-wrap-style:square;mso-width-percent:0;mso-wrap-distance-left:9pt;mso-wrap-distance-top:0;mso-wrap-distance-right:9pt;mso-wrap-distance-bottom:0;mso-position-horizontal:absolute;mso-position-horizontal-relative:margin;mso-position-vertical:absolute;mso-position-vertical-relative:text;mso-width-percent:0;mso-width-relative:margin" from="-.1pt,3.3pt" to="496.8pt,3.3pt" o:gfxdata="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" strokecolor="black [3213]" strokeweight="1.5pt">
+              <w10:wrap anchorx="margin"/>
+            </v:line>
+          </w:pict>
+        </mc:Fallback>
+      </mc:AlternateContent>
+    </w:r>
+    <w:r>
+      <w:rPr>
+        <w:rFonts w:ascii="Times New Roman" w:hAnsi="Times New Roman" w:cs="Times New Roman"/>
+        <w:b/>
+        <w:bCs/>
+        <w:noProof/>
+      </w:rPr>
+      <mc:AlternateContent>
+        <mc:Choice Requires="wps">
+          <w:drawing>
+            <wp:anchor distT="0" distB="0" distL="114300" distR="114300" simplePos="0" relativeHeight="251660288" behindDoc="0" locked="0" layoutInCell="1" allowOverlap="1" wp14:anchorId="070753D5" wp14:editId="3F27C388">
+              <wp:simplePos x="0" y="0"/>
+              <wp:positionH relativeFrom="margin">
+                <wp:posOffset>3175</wp:posOffset>
+              </wp:positionH>
+              <wp:positionV relativeFrom="paragraph">
+                <wp:posOffset>73062</wp:posOffset>
+              </wp:positionV>
+              <wp:extent cx="6306185" cy="0"/>
+              <wp:effectExtent l="0" t="0" r="0" b="0"/>
+              <wp:wrapNone/>
+              <wp:docPr id="7" name="Straight Connector 7"/>
+              <wp:cNvGraphicFramePr/>
+              <a:graphic xmlns:a="http://schemas.openxmlformats.org/drawingml/2006/main">
+                <a:graphicData uri="http://schemas.microsoft.com/office/word/2010/wordprocessingShape">
+                  <wps:wsp>
+                    <wps:cNvCnPr/>
+                    <wps:spPr>
+                      <a:xfrm>
+                        <a:off x="0" y="0"/>
+                        <a:ext cx="6306185" cy="0"/>
+                      </a:xfrm>
+                      <a:prstGeom prst="line">
+                        <a:avLst/>
+                      </a:prstGeom>
+                      <a:ln w="8890">
+                        <a:solidFill>
+                          <a:schemeClr val="tx1"/>
+                        </a:solidFill>
+                      </a:ln>
+                    </wps:spPr>
+                    <wps:style>
+                      <a:lnRef idx="1">
+                        <a:schemeClr val="accent1"/>
+                      </a:lnRef>
+                      <a:fillRef idx="0">
+                        <a:schemeClr val="accent1"/>
+                      </a:fillRef>
+                      <a:effectRef idx="0">
+                        <a:schemeClr val="accent1"/>
+                      </a:effectRef>
+                      <a:fontRef idx="minor">
+                        <a:schemeClr val="tx1"/>
+                      </a:fontRef>
+                    </wps:style>
+                    <wps:bodyPr/>
+                  </wps:wsp>
+                </a:graphicData>
+              </a:graphic>
+              <wp14:sizeRelH relativeFrom="margin">
+                <wp14:pctWidth>0</wp14:pctWidth>
+              </wp14:sizeRelH>
+            </wp:anchor>
+          </w:drawing>
+        </mc:Choice>
+        <mc:Fallback>
+          <w:pict>
+            <v:line w14:anchorId="0D0A5809" id="Straight Connector 7" o:spid="_x0000_s1026" style="position:absolute;z-index:251660288;visibility:visible;mso-wrap-style:square;mso-width-percent:0;mso-wrap-distance-left:9pt;mso-wrap-distance-top:0;mso-wrap-distance-right:9pt;mso-wrap-distance-bottom:0;mso-position-horizontal:absolute;mso-position-horizontal-relative:margin;mso-position-vertical:absolute;mso-position-vertical-relative:text;mso-width-percent:0;mso-width-relative:margin" from=".25pt,5.75pt" to="496.8pt,5.75pt" o:gfxdata="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" strokecolor="black [3213]" strokeweight=".7pt">
+              <w10:wrap anchorx="margin"/>
+            </v:line>
+          </w:pict>
+        </mc:Fallback>
+      </mc:AlternateContent>
+    </w:r>
+  </w:p>
+  <w:p>
+    <w:pPr>
+      <w:pStyle w:val="Header"/>
+    </w:pPr>
+  </w:p>
+</w:hdr>
 </file>
 
 <file path=word/numbering.xml><?xml version="1.0" encoding="utf-8"?>
@@ -3891,6 +4376,50 @@
       <w:rFonts w:eastAsiaTheme="minorHAnsi"/>
     </w:rPr>
   </w:style>
+  <w:style w:type="paragraph" w:styleId="Header">
+    <w:name w:val="header"/>
+    <w:basedOn w:val="Normal"/>
+    <w:link w:val="HeaderChar"/>
+    <w:uiPriority w:val="99"/>
+    <w:unhideWhenUsed/>
+    <w:rsid w:val="00B92BDC"/>
+    <w:pPr>
+      <w:tabs>
+        <w:tab w:val="center" w:pos="4513"/>
+        <w:tab w:val="right" w:pos="9026"/>
+      </w:tabs>
+      <w:spacing w:after="0" w:line="240" w:lineRule="auto"/>
+    </w:pPr>
+  </w:style>
+  <w:style w:type="character" w:customStyle="1" w:styleId="HeaderChar">
+    <w:name w:val="Header Char"/>
+    <w:basedOn w:val="DefaultParagraphFont"/>
+    <w:link w:val="Header"/>
+    <w:uiPriority w:val="99"/>
+    <w:rsid w:val="00B92BDC"/>
+  </w:style>
+  <w:style w:type="paragraph" w:styleId="Footer">
+    <w:name w:val="footer"/>
+    <w:basedOn w:val="Normal"/>
+    <w:link w:val="FooterChar"/>
+    <w:uiPriority w:val="99"/>
+    <w:unhideWhenUsed/>
+    <w:rsid w:val="00B92BDC"/>
+    <w:pPr>
+      <w:tabs>
+        <w:tab w:val="center" w:pos="4513"/>
+        <w:tab w:val="right" w:pos="9026"/>
+      </w:tabs>
+      <w:spacing w:after="0" w:line="240" w:lineRule="auto"/>
+    </w:pPr>
+  </w:style>
+  <w:style w:type="character" w:customStyle="1" w:styleId="FooterChar">
+    <w:name w:val="Footer Char"/>
+    <w:basedOn w:val="DefaultParagraphFont"/>
+    <w:link w:val="Footer"/>
+    <w:uiPriority w:val="99"/>
+    <w:rsid w:val="00B92BDC"/>
+  </w:style>
 </w:styles>
 </file>
 

</xml_diff>